<commit_message>
add 78-88 chapters to docs
</commit_message>
<xml_diff>
--- a/Персонажи.docx
+++ b/Персонажи.docx
@@ -3124,7 +3124,61 @@
           <w:sz w:val="28"/>
           <w:szCs w:val="28"/>
         </w:rPr>
-        <w:t xml:space="preserve">, куда отправилась Си У, и где скрывался восьмой принц Чжоу Го </w:t>
+        <w:t>, куда отправилась Си У, и где скрывался восьмой принц Чжоу Го</w:t>
+      </w:r>
+    </w:p>
+    <w:p>
+      <w:pPr>
+        <w:rPr>
+          <w:rFonts w:ascii="Times New Roman" w:hAnsi="Times New Roman" w:cs="Times New Roman"/>
+          <w:sz w:val="28"/>
+          <w:szCs w:val="28"/>
+        </w:rPr>
+      </w:pPr>
+      <w:r>
+        <w:rPr>
+          <w:rFonts w:ascii="Times New Roman" w:hAnsi="Times New Roman" w:cs="Times New Roman"/>
+          <w:b/>
+          <w:bCs/>
+          <w:sz w:val="28"/>
+          <w:szCs w:val="28"/>
+        </w:rPr>
+        <w:t>Линьвэй</w:t>
+      </w:r>
+      <w:r>
+        <w:rPr>
+          <w:rFonts w:ascii="Times New Roman" w:hAnsi="Times New Roman" w:cs="Times New Roman"/>
+          <w:sz w:val="28"/>
+          <w:szCs w:val="28"/>
+        </w:rPr>
+        <w:t xml:space="preserve"> () – город, где погибла Е Си У</w:t>
+      </w:r>
+    </w:p>
+    <w:p>
+      <w:pPr>
+        <w:rPr>
+          <w:rFonts w:ascii="Times New Roman" w:hAnsi="Times New Roman" w:cs="Times New Roman"/>
+          <w:sz w:val="28"/>
+          <w:szCs w:val="28"/>
+        </w:rPr>
+      </w:pPr>
+      <w:r>
+        <w:rPr>
+          <w:rFonts w:ascii="Times New Roman" w:hAnsi="Times New Roman" w:cs="Times New Roman"/>
+          <w:b/>
+          <w:bCs/>
+          <w:sz w:val="28"/>
+          <w:szCs w:val="28"/>
+        </w:rPr>
+        <w:t>Чжаося</w:t>
+      </w:r>
+      <w:r>
+        <w:rPr>
+          <w:rFonts w:ascii="Times New Roman" w:hAnsi="Times New Roman" w:cs="Times New Roman"/>
+          <w:sz w:val="28"/>
+          <w:szCs w:val="28"/>
+        </w:rPr>
+        <w:t xml:space="preserve"> – город, где открылись врата в тайное царство</w:t>
       </w:r>
     </w:p>
     <w:p>
@@ -3243,6 +3297,244 @@
           <w:szCs w:val="28"/>
         </w:rPr>
         <w:t>.</w:t>
+      </w:r>
+    </w:p>
+    <w:p>
+      <w:pPr>
+        <w:rPr>
+          <w:rFonts w:ascii="Times New Roman" w:hAnsi="Times New Roman" w:cs="Times New Roman"/>
+          <w:sz w:val="28"/>
+          <w:szCs w:val="28"/>
+        </w:rPr>
+      </w:pPr>
+      <w:r>
+        <w:rPr>
+          <w:rFonts w:ascii="Times New Roman" w:hAnsi="Times New Roman" w:cs="Times New Roman"/>
+          <w:b/>
+          <w:bCs/>
+          <w:sz w:val="28"/>
+          <w:szCs w:val="28"/>
+        </w:rPr>
+        <w:t xml:space="preserve">Священная гора </w:t>
+      </w:r>
+      <w:r>
+        <w:rPr>
+          <w:rFonts w:ascii="Times New Roman" w:hAnsi="Times New Roman" w:cs="Times New Roman"/>
+          <w:b/>
+          <w:bCs/>
+          <w:sz w:val="28"/>
+          <w:szCs w:val="28"/>
+        </w:rPr>
+        <w:t>Пэнлай</w:t>
+      </w:r>
+      <w:r>
+        <w:rPr>
+          <w:rFonts w:ascii="Times New Roman" w:hAnsi="Times New Roman" w:cs="Times New Roman"/>
+          <w:b/>
+          <w:bCs/>
+          <w:sz w:val="28"/>
+          <w:szCs w:val="28"/>
+        </w:rPr>
+        <w:t xml:space="preserve"> </w:t>
+      </w:r>
+      <w:r>
+        <w:rPr>
+          <w:rFonts w:ascii="Times New Roman" w:hAnsi="Times New Roman" w:cs="Times New Roman"/>
+          <w:sz w:val="28"/>
+          <w:szCs w:val="28"/>
+        </w:rPr>
+        <w:t xml:space="preserve">– место обучения мечников, где училась Су </w:t>
+      </w:r>
+      <w:proofErr w:type="spellStart"/>
+      <w:r>
+        <w:rPr>
+          <w:rFonts w:ascii="Times New Roman" w:hAnsi="Times New Roman" w:cs="Times New Roman"/>
+          <w:sz w:val="28"/>
+          <w:szCs w:val="28"/>
+        </w:rPr>
+        <w:t>Су</w:t>
+      </w:r>
+      <w:proofErr w:type="spellEnd"/>
+      <w:r>
+        <w:rPr>
+          <w:rFonts w:ascii="Times New Roman" w:hAnsi="Times New Roman" w:cs="Times New Roman"/>
+          <w:sz w:val="28"/>
+          <w:szCs w:val="28"/>
+        </w:rPr>
+        <w:t>.</w:t>
+      </w:r>
+    </w:p>
+    <w:p>
+      <w:pPr>
+        <w:rPr>
+          <w:rFonts w:ascii="Times New Roman" w:hAnsi="Times New Roman" w:cs="Times New Roman"/>
+          <w:sz w:val="28"/>
+          <w:szCs w:val="28"/>
+        </w:rPr>
+      </w:pPr>
+      <w:r>
+        <w:rPr>
+          <w:rFonts w:ascii="Times New Roman" w:hAnsi="Times New Roman" w:cs="Times New Roman"/>
+          <w:b/>
+          <w:bCs/>
+          <w:sz w:val="28"/>
+          <w:szCs w:val="28"/>
+        </w:rPr>
+        <w:t xml:space="preserve">Тайное царство </w:t>
+      </w:r>
+      <w:r>
+        <w:rPr>
+          <w:rFonts w:ascii="Times New Roman" w:hAnsi="Times New Roman" w:cs="Times New Roman"/>
+          <w:b/>
+          <w:bCs/>
+          <w:sz w:val="28"/>
+          <w:szCs w:val="28"/>
+        </w:rPr>
+        <w:t>Цаньюань</w:t>
+      </w:r>
+      <w:r>
+        <w:rPr>
+          <w:rFonts w:ascii="Times New Roman" w:hAnsi="Times New Roman" w:cs="Times New Roman"/>
+          <w:sz w:val="28"/>
+          <w:szCs w:val="28"/>
+        </w:rPr>
+        <w:t xml:space="preserve"> – место с опасностями и древними артефактами, открывающееся раз в сотню лет</w:t>
+      </w:r>
+    </w:p>
+    <w:p>
+      <w:pPr>
+        <w:rPr>
+          <w:rFonts w:ascii="Times New Roman" w:hAnsi="Times New Roman" w:cs="Times New Roman"/>
+          <w:sz w:val="28"/>
+          <w:szCs w:val="28"/>
+        </w:rPr>
+      </w:pPr>
+      <w:r>
+        <w:rPr>
+          <w:rFonts w:ascii="Times New Roman" w:hAnsi="Times New Roman" w:cs="Times New Roman"/>
+          <w:b/>
+          <w:bCs/>
+          <w:sz w:val="28"/>
+          <w:szCs w:val="28"/>
+        </w:rPr>
+        <w:t>Чанцзе</w:t>
+      </w:r>
+      <w:r>
+        <w:rPr>
+          <w:rFonts w:ascii="Times New Roman" w:hAnsi="Times New Roman" w:cs="Times New Roman"/>
+          <w:sz w:val="28"/>
+          <w:szCs w:val="28"/>
+        </w:rPr>
+        <w:t xml:space="preserve"> – гора секты Хэньян.</w:t>
+      </w:r>
+    </w:p>
+    <w:p>
+      <w:pPr>
+        <w:rPr>
+          <w:rFonts w:ascii="Times New Roman" w:hAnsi="Times New Roman" w:cs="Times New Roman"/>
+          <w:sz w:val="28"/>
+          <w:szCs w:val="28"/>
+        </w:rPr>
+      </w:pPr>
+      <w:r>
+        <w:rPr>
+          <w:rFonts w:ascii="Times New Roman" w:hAnsi="Times New Roman" w:cs="Times New Roman"/>
+          <w:b/>
+          <w:bCs/>
+          <w:sz w:val="28"/>
+          <w:szCs w:val="28"/>
+        </w:rPr>
+        <w:t>Тайсю</w:t>
+      </w:r>
+      <w:r>
+        <w:rPr>
+          <w:rFonts w:ascii="Times New Roman" w:hAnsi="Times New Roman" w:cs="Times New Roman"/>
+          <w:sz w:val="28"/>
+          <w:szCs w:val="28"/>
+        </w:rPr>
+        <w:t xml:space="preserve"> – перебитая секта</w:t>
+      </w:r>
+    </w:p>
+    <w:p>
+      <w:pPr>
+        <w:rPr>
+          <w:rFonts w:ascii="Times New Roman" w:hAnsi="Times New Roman" w:cs="Times New Roman"/>
+          <w:sz w:val="28"/>
+          <w:szCs w:val="28"/>
+        </w:rPr>
+      </w:pPr>
+      <w:r>
+        <w:rPr>
+          <w:rFonts w:ascii="Times New Roman" w:hAnsi="Times New Roman" w:cs="Times New Roman"/>
+          <w:b/>
+          <w:bCs/>
+          <w:sz w:val="28"/>
+          <w:szCs w:val="28"/>
+        </w:rPr>
+        <w:t>Чжень Ву</w:t>
+      </w:r>
+      <w:r>
+        <w:rPr>
+          <w:rFonts w:ascii="Times New Roman" w:hAnsi="Times New Roman" w:cs="Times New Roman"/>
+          <w:sz w:val="28"/>
+          <w:szCs w:val="28"/>
+        </w:rPr>
+        <w:t xml:space="preserve"> – ещё одна секта</w:t>
+      </w:r>
+    </w:p>
+    <w:p>
+      <w:pPr>
+        <w:rPr>
+          <w:rFonts w:ascii="Times New Roman" w:hAnsi="Times New Roman" w:cs="Times New Roman"/>
+          <w:sz w:val="28"/>
+          <w:szCs w:val="28"/>
+        </w:rPr>
+      </w:pPr>
+      <w:r>
+        <w:rPr>
+          <w:rFonts w:ascii="Times New Roman" w:hAnsi="Times New Roman" w:cs="Times New Roman"/>
+          <w:b/>
+          <w:bCs/>
+          <w:sz w:val="28"/>
+          <w:szCs w:val="28"/>
+        </w:rPr>
+        <w:t xml:space="preserve">Тянь Бань </w:t>
+      </w:r>
+      <w:r>
+        <w:rPr>
+          <w:rFonts w:ascii="Times New Roman" w:hAnsi="Times New Roman" w:cs="Times New Roman"/>
+          <w:sz w:val="28"/>
+          <w:szCs w:val="28"/>
+        </w:rPr>
+        <w:t>– ещё одна секта</w:t>
+      </w:r>
+    </w:p>
+    <w:p>
+      <w:pPr>
+        <w:rPr>
+          <w:rFonts w:ascii="Times New Roman" w:hAnsi="Times New Roman" w:cs="Times New Roman"/>
+          <w:sz w:val="28"/>
+          <w:szCs w:val="28"/>
+          <w:lang w:val="en-US"/>
+        </w:rPr>
+      </w:pPr>
+      <w:r>
+        <w:rPr>
+          <w:rFonts w:ascii="Times New Roman" w:hAnsi="Times New Roman" w:cs="Times New Roman"/>
+          <w:b/>
+          <w:bCs/>
+          <w:sz w:val="28"/>
+          <w:szCs w:val="28"/>
+        </w:rPr>
+        <w:t>Тяньчи</w:t>
+      </w:r>
+      <w:r>
+        <w:rPr>
+          <w:rFonts w:ascii="Times New Roman" w:hAnsi="Times New Roman" w:cs="Times New Roman"/>
+          <w:sz w:val="28"/>
+          <w:szCs w:val="28"/>
+        </w:rPr>
+        <w:t xml:space="preserve"> – озеро возле Чанцзе</w:t>
       </w:r>
     </w:p>
     <w:p>
@@ -3305,6 +3597,7 @@
           <w:sz w:val="28"/>
           <w:szCs w:val="28"/>
         </w:rPr>
+        <w:lastRenderedPageBreak/>
         <w:t>Императорское поместье:</w:t>
       </w:r>
     </w:p>
@@ -3516,6 +3809,14 @@
           <w:sz w:val="28"/>
           <w:szCs w:val="28"/>
         </w:rPr>
+        <w:t xml:space="preserve"> </w:t>
+      </w:r>
+      <w:r>
+        <w:rPr>
+          <w:rFonts w:ascii="Times New Roman" w:hAnsi="Times New Roman" w:cs="Times New Roman"/>
+          <w:sz w:val="28"/>
+          <w:szCs w:val="28"/>
+        </w:rPr>
         <w:t>государственн</w:t>
       </w:r>
       <w:r>
@@ -3557,6 +3858,70 @@
           <w:szCs w:val="28"/>
         </w:rPr>
         <w:t>, преданный Тан Тай Мин Лану и убивший себя, не признав императором Тай Цзиня.</w:t>
+      </w:r>
+    </w:p>
+    <w:p>
+      <w:pPr>
+        <w:rPr>
+          <w:rFonts w:ascii="Times New Roman" w:hAnsi="Times New Roman" w:cs="Times New Roman"/>
+          <w:sz w:val="28"/>
+          <w:szCs w:val="28"/>
+        </w:rPr>
+      </w:pPr>
+      <w:r>
+        <w:rPr>
+          <w:rFonts w:ascii="Times New Roman" w:hAnsi="Times New Roman" w:cs="Times New Roman"/>
+          <w:b/>
+          <w:bCs/>
+          <w:sz w:val="28"/>
+          <w:szCs w:val="28"/>
+        </w:rPr>
+        <w:t xml:space="preserve">Тан Тай Мин </w:t>
+      </w:r>
+      <w:r>
+        <w:rPr>
+          <w:rFonts w:ascii="Times New Roman" w:hAnsi="Times New Roman" w:cs="Times New Roman"/>
+          <w:b/>
+          <w:bCs/>
+          <w:sz w:val="28"/>
+          <w:szCs w:val="28"/>
+        </w:rPr>
+        <w:t>Лан</w:t>
+      </w:r>
+      <w:r>
+        <w:rPr>
+          <w:rFonts w:ascii="Times New Roman" w:hAnsi="Times New Roman" w:cs="Times New Roman"/>
+          <w:sz w:val="28"/>
+          <w:szCs w:val="28"/>
+        </w:rPr>
+        <w:t xml:space="preserve"> – старший брат Тан Тай Цзиня</w:t>
+      </w:r>
+    </w:p>
+    <w:p>
+      <w:pPr>
+        <w:rPr>
+          <w:rFonts w:ascii="Times New Roman" w:hAnsi="Times New Roman" w:cs="Times New Roman"/>
+          <w:sz w:val="28"/>
+          <w:szCs w:val="28"/>
+        </w:rPr>
+      </w:pPr>
+      <w:r>
+        <w:rPr>
+          <w:rFonts w:ascii="Times New Roman" w:hAnsi="Times New Roman" w:cs="Times New Roman"/>
+          <w:b/>
+          <w:bCs/>
+          <w:sz w:val="28"/>
+          <w:szCs w:val="28"/>
+        </w:rPr>
+        <w:t>Тан Тай Мин Хань</w:t>
+      </w:r>
+      <w:r>
+        <w:rPr>
+          <w:rFonts w:ascii="Times New Roman" w:hAnsi="Times New Roman" w:cs="Times New Roman"/>
+          <w:sz w:val="28"/>
+          <w:szCs w:val="28"/>
+        </w:rPr>
+        <w:t xml:space="preserve"> – восьмой принц Чжоу Го, младший брат Тан Тай Цзиня</w:t>
       </w:r>
     </w:p>
     <w:p>
@@ -3865,6 +4230,7 @@
           <w:sz w:val="28"/>
           <w:szCs w:val="28"/>
         </w:rPr>
+        <w:lastRenderedPageBreak/>
         <w:t xml:space="preserve">Ли Су </w:t>
       </w:r>
       <w:proofErr w:type="spellStart"/>
@@ -3932,6 +4298,46 @@
       <w:r>
         <w:rPr>
           <w:rFonts w:ascii="Times New Roman" w:hAnsi="Times New Roman" w:cs="Times New Roman"/>
+          <w:b/>
+          <w:bCs/>
+          <w:sz w:val="28"/>
+          <w:szCs w:val="28"/>
+          <w:lang w:val="en-US"/>
+        </w:rPr>
+        <w:t>(</w:t>
+      </w:r>
+      <w:r>
+        <w:rPr>
+          <w:rFonts w:ascii="Times New Roman" w:hAnsi="Times New Roman" w:cs="Times New Roman"/>
+          <w:sz w:val="28"/>
+          <w:szCs w:val="28"/>
+        </w:rPr>
+        <w:t xml:space="preserve">фея </w:t>
+      </w:r>
+      <w:r>
+        <w:rPr>
+          <w:rFonts w:ascii="Times New Roman" w:hAnsi="Times New Roman" w:cs="Times New Roman"/>
+          <w:b/>
+          <w:bCs/>
+          <w:sz w:val="28"/>
+          <w:szCs w:val="28"/>
+        </w:rPr>
+        <w:t>Юн Лин</w:t>
+      </w:r>
+      <w:r>
+        <w:rPr>
+          <w:rFonts w:ascii="Times New Roman" w:hAnsi="Times New Roman" w:cs="Times New Roman"/>
+          <w:b/>
+          <w:bCs/>
+          <w:sz w:val="28"/>
+          <w:szCs w:val="28"/>
+          <w:lang w:val="en-US"/>
+        </w:rPr>
+        <w:t>)</w:t>
+      </w:r>
+      <w:r>
+        <w:rPr>
+          <w:rFonts w:ascii="Times New Roman" w:hAnsi="Times New Roman" w:cs="Times New Roman"/>
           <w:sz w:val="28"/>
           <w:szCs w:val="28"/>
         </w:rPr>
@@ -3991,7 +4397,27 @@
           <w:sz w:val="28"/>
           <w:szCs w:val="28"/>
         </w:rPr>
-        <w:t>Гун Е Чжеу</w:t>
+        <w:t>Гун Е Чж</w:t>
+      </w:r>
+      <w:r>
+        <w:rPr>
+          <w:rFonts w:ascii="Times New Roman" w:hAnsi="Times New Roman" w:cs="Times New Roman"/>
+          <w:b/>
+          <w:bCs/>
+          <w:sz w:val="28"/>
+          <w:szCs w:val="28"/>
+        </w:rPr>
+        <w:t>и</w:t>
+      </w:r>
+      <w:r>
+        <w:rPr>
+          <w:rFonts w:ascii="Times New Roman" w:hAnsi="Times New Roman" w:cs="Times New Roman"/>
+          <w:b/>
+          <w:bCs/>
+          <w:sz w:val="28"/>
+          <w:szCs w:val="28"/>
+        </w:rPr>
+        <w:t>у</w:t>
       </w:r>
       <w:r>
         <w:rPr>
@@ -4249,6 +4675,158 @@
     </w:p>
     <w:p>
       <w:pPr>
+        <w:rPr>
+          <w:rFonts w:ascii="Times New Roman" w:hAnsi="Times New Roman" w:cs="Times New Roman"/>
+          <w:sz w:val="28"/>
+          <w:szCs w:val="28"/>
+        </w:rPr>
+      </w:pPr>
+      <w:r>
+        <w:rPr>
+          <w:rFonts w:ascii="Times New Roman" w:hAnsi="Times New Roman" w:cs="Times New Roman"/>
+          <w:b/>
+          <w:bCs/>
+          <w:sz w:val="28"/>
+          <w:szCs w:val="28"/>
+        </w:rPr>
+        <w:t>Яо Вэй</w:t>
+      </w:r>
+      <w:r>
+        <w:rPr>
+          <w:rFonts w:ascii="Times New Roman" w:hAnsi="Times New Roman" w:cs="Times New Roman"/>
+          <w:sz w:val="28"/>
+          <w:szCs w:val="28"/>
+        </w:rPr>
+        <w:t xml:space="preserve"> – сестра из ранних воспоминаний Су </w:t>
+      </w:r>
+      <w:proofErr w:type="spellStart"/>
+      <w:r>
+        <w:rPr>
+          <w:rFonts w:ascii="Times New Roman" w:hAnsi="Times New Roman" w:cs="Times New Roman"/>
+          <w:sz w:val="28"/>
+          <w:szCs w:val="28"/>
+        </w:rPr>
+        <w:t>Су</w:t>
+      </w:r>
+      <w:proofErr w:type="spellEnd"/>
+      <w:r>
+        <w:rPr>
+          <w:rFonts w:ascii="Times New Roman" w:hAnsi="Times New Roman" w:cs="Times New Roman"/>
+          <w:sz w:val="28"/>
+          <w:szCs w:val="28"/>
+        </w:rPr>
+        <w:t>.</w:t>
+      </w:r>
+    </w:p>
+    <w:p>
+      <w:pPr>
+        <w:rPr>
+          <w:rFonts w:ascii="Times New Roman" w:hAnsi="Times New Roman" w:cs="Times New Roman"/>
+          <w:sz w:val="28"/>
+          <w:szCs w:val="28"/>
+          <w:lang w:val="en-US"/>
+        </w:rPr>
+      </w:pPr>
+      <w:r>
+        <w:rPr>
+          <w:rFonts w:ascii="Times New Roman" w:hAnsi="Times New Roman" w:cs="Times New Roman"/>
+          <w:b/>
+          <w:bCs/>
+          <w:sz w:val="28"/>
+          <w:szCs w:val="28"/>
+        </w:rPr>
+        <w:t>Ци Юэ</w:t>
+      </w:r>
+      <w:r>
+        <w:rPr>
+          <w:rFonts w:ascii="Times New Roman" w:hAnsi="Times New Roman" w:cs="Times New Roman"/>
+          <w:sz w:val="28"/>
+          <w:szCs w:val="28"/>
+        </w:rPr>
+        <w:t xml:space="preserve"> – старший собрат из </w:t>
+      </w:r>
+      <w:r>
+        <w:rPr>
+          <w:rFonts w:ascii="Times New Roman" w:hAnsi="Times New Roman" w:cs="Times New Roman"/>
+          <w:sz w:val="28"/>
+          <w:szCs w:val="28"/>
+        </w:rPr>
+        <w:t xml:space="preserve">ранних воспоминаний Су </w:t>
+      </w:r>
+      <w:proofErr w:type="spellStart"/>
+      <w:r>
+        <w:rPr>
+          <w:rFonts w:ascii="Times New Roman" w:hAnsi="Times New Roman" w:cs="Times New Roman"/>
+          <w:sz w:val="28"/>
+          <w:szCs w:val="28"/>
+        </w:rPr>
+        <w:t>Су</w:t>
+      </w:r>
+      <w:proofErr w:type="spellEnd"/>
+      <w:r>
+        <w:rPr>
+          <w:rFonts w:ascii="Times New Roman" w:hAnsi="Times New Roman" w:cs="Times New Roman"/>
+          <w:sz w:val="28"/>
+          <w:szCs w:val="28"/>
+        </w:rPr>
+        <w:t>.</w:t>
+      </w:r>
+    </w:p>
+    <w:p>
+      <w:pPr>
+        <w:rPr>
+          <w:rFonts w:ascii="Times New Roman" w:hAnsi="Times New Roman" w:cs="Times New Roman"/>
+          <w:sz w:val="28"/>
+          <w:szCs w:val="28"/>
+        </w:rPr>
+      </w:pPr>
+      <w:r>
+        <w:rPr>
+          <w:rFonts w:ascii="Times New Roman" w:hAnsi="Times New Roman" w:cs="Times New Roman"/>
+          <w:b/>
+          <w:bCs/>
+          <w:sz w:val="28"/>
+          <w:szCs w:val="28"/>
+        </w:rPr>
+        <w:t>Лин Яо</w:t>
+      </w:r>
+      <w:r>
+        <w:rPr>
+          <w:rFonts w:ascii="Times New Roman" w:hAnsi="Times New Roman" w:cs="Times New Roman"/>
+          <w:sz w:val="28"/>
+          <w:szCs w:val="28"/>
+        </w:rPr>
+        <w:t xml:space="preserve"> – </w:t>
+      </w:r>
+      <w:r>
+        <w:rPr>
+          <w:rFonts w:ascii="Times New Roman" w:hAnsi="Times New Roman" w:cs="Times New Roman"/>
+          <w:sz w:val="28"/>
+          <w:szCs w:val="28"/>
+        </w:rPr>
+        <w:t xml:space="preserve">собрат Ли Су </w:t>
+      </w:r>
+      <w:proofErr w:type="spellStart"/>
+      <w:r>
+        <w:rPr>
+          <w:rFonts w:ascii="Times New Roman" w:hAnsi="Times New Roman" w:cs="Times New Roman"/>
+          <w:sz w:val="28"/>
+          <w:szCs w:val="28"/>
+        </w:rPr>
+        <w:t>Су</w:t>
+      </w:r>
+      <w:proofErr w:type="spellEnd"/>
+      <w:r>
+        <w:rPr>
+          <w:rFonts w:ascii="Times New Roman" w:hAnsi="Times New Roman" w:cs="Times New Roman"/>
+          <w:sz w:val="28"/>
+          <w:szCs w:val="28"/>
+        </w:rPr>
+        <w:t>.</w:t>
+      </w:r>
+    </w:p>
+    <w:p>
+      <w:pPr>
         <w:ind w:firstLine="708"/>
         <w:rPr>
           <w:rFonts w:ascii="Times New Roman" w:hAnsi="Times New Roman" w:cs="Times New Roman"/>
@@ -4268,6 +4846,388 @@
           <w:szCs w:val="28"/>
         </w:rPr>
       </w:pPr>
+      <w:proofErr w:type="spellStart"/>
+      <w:r>
+        <w:rPr>
+          <w:rFonts w:ascii="Times New Roman" w:hAnsi="Times New Roman" w:cs="Times New Roman"/>
+          <w:b/>
+          <w:bCs/>
+          <w:sz w:val="28"/>
+          <w:szCs w:val="28"/>
+        </w:rPr>
+        <w:t>Чисяо</w:t>
+      </w:r>
+      <w:proofErr w:type="spellEnd"/>
+      <w:r>
+        <w:rPr>
+          <w:rFonts w:ascii="Times New Roman" w:hAnsi="Times New Roman" w:cs="Times New Roman"/>
+          <w:b/>
+          <w:bCs/>
+          <w:sz w:val="28"/>
+          <w:szCs w:val="28"/>
+        </w:rPr>
+        <w:t>:</w:t>
+      </w:r>
+    </w:p>
+    <w:p>
+      <w:pPr>
+        <w:rPr>
+          <w:rFonts w:ascii="Times New Roman" w:hAnsi="Times New Roman" w:cs="Times New Roman"/>
+          <w:sz w:val="28"/>
+          <w:szCs w:val="28"/>
+        </w:rPr>
+      </w:pPr>
+      <w:proofErr w:type="spellStart"/>
+      <w:r>
+        <w:rPr>
+          <w:rFonts w:ascii="Times New Roman" w:hAnsi="Times New Roman" w:cs="Times New Roman"/>
+          <w:b/>
+          <w:bCs/>
+          <w:sz w:val="28"/>
+          <w:szCs w:val="28"/>
+        </w:rPr>
+        <w:t>Цэнь</w:t>
+      </w:r>
+      <w:proofErr w:type="spellEnd"/>
+      <w:r>
+        <w:rPr>
+          <w:rFonts w:ascii="Times New Roman" w:hAnsi="Times New Roman" w:cs="Times New Roman"/>
+          <w:b/>
+          <w:bCs/>
+          <w:sz w:val="28"/>
+          <w:szCs w:val="28"/>
+        </w:rPr>
+        <w:t xml:space="preserve"> Ми Сюань</w:t>
+      </w:r>
+      <w:r>
+        <w:rPr>
+          <w:rFonts w:ascii="Times New Roman" w:hAnsi="Times New Roman" w:cs="Times New Roman"/>
+          <w:sz w:val="28"/>
+          <w:szCs w:val="28"/>
+        </w:rPr>
+        <w:t xml:space="preserve"> – дочь главы клана </w:t>
+      </w:r>
+      <w:proofErr w:type="spellStart"/>
+      <w:r>
+        <w:rPr>
+          <w:rFonts w:ascii="Times New Roman" w:hAnsi="Times New Roman" w:cs="Times New Roman"/>
+          <w:sz w:val="28"/>
+          <w:szCs w:val="28"/>
+        </w:rPr>
+        <w:t>Чисяо</w:t>
+      </w:r>
+      <w:proofErr w:type="spellEnd"/>
+      <w:r>
+        <w:rPr>
+          <w:rFonts w:ascii="Times New Roman" w:hAnsi="Times New Roman" w:cs="Times New Roman"/>
+          <w:sz w:val="28"/>
+          <w:szCs w:val="28"/>
+        </w:rPr>
+        <w:t>.</w:t>
+      </w:r>
+    </w:p>
+    <w:p>
+      <w:pPr>
+        <w:rPr>
+          <w:rFonts w:ascii="Times New Roman" w:hAnsi="Times New Roman" w:cs="Times New Roman"/>
+          <w:sz w:val="28"/>
+          <w:szCs w:val="28"/>
+        </w:rPr>
+      </w:pPr>
+      <w:r>
+        <w:rPr>
+          <w:rFonts w:ascii="Times New Roman" w:hAnsi="Times New Roman" w:cs="Times New Roman"/>
+          <w:b/>
+          <w:bCs/>
+          <w:sz w:val="28"/>
+          <w:szCs w:val="28"/>
+        </w:rPr>
+        <w:t>Ин Чжуан</w:t>
+      </w:r>
+      <w:r>
+        <w:rPr>
+          <w:rFonts w:ascii="Times New Roman" w:hAnsi="Times New Roman" w:cs="Times New Roman"/>
+          <w:sz w:val="28"/>
+          <w:szCs w:val="28"/>
+        </w:rPr>
+        <w:t xml:space="preserve"> – старший брат, Ми Сюань, который за ней присматривает</w:t>
+      </w:r>
+    </w:p>
+    <w:p>
+      <w:pPr>
+        <w:ind w:firstLine="708"/>
+        <w:rPr>
+          <w:rFonts w:ascii="Times New Roman" w:hAnsi="Times New Roman" w:cs="Times New Roman"/>
+          <w:sz w:val="28"/>
+          <w:szCs w:val="28"/>
+        </w:rPr>
+      </w:pPr>
+    </w:p>
+    <w:p>
+      <w:pPr>
+        <w:ind w:firstLine="708"/>
+        <w:rPr>
+          <w:rFonts w:ascii="Times New Roman" w:hAnsi="Times New Roman" w:cs="Times New Roman"/>
+          <w:b/>
+          <w:bCs/>
+          <w:sz w:val="28"/>
+          <w:szCs w:val="28"/>
+        </w:rPr>
+      </w:pPr>
+      <w:r>
+        <w:rPr>
+          <w:rFonts w:ascii="Times New Roman" w:hAnsi="Times New Roman" w:cs="Times New Roman"/>
+          <w:b/>
+          <w:bCs/>
+          <w:sz w:val="28"/>
+          <w:szCs w:val="28"/>
+        </w:rPr>
+        <w:t>Сяояо:</w:t>
+      </w:r>
+    </w:p>
+    <w:p>
+      <w:pPr>
+        <w:rPr>
+          <w:rFonts w:ascii="Times New Roman" w:hAnsi="Times New Roman" w:cs="Times New Roman"/>
+          <w:sz w:val="28"/>
+          <w:szCs w:val="28"/>
+        </w:rPr>
+      </w:pPr>
+      <w:r>
+        <w:rPr>
+          <w:rFonts w:ascii="Times New Roman" w:hAnsi="Times New Roman" w:cs="Times New Roman"/>
+          <w:b/>
+          <w:bCs/>
+          <w:sz w:val="28"/>
+          <w:szCs w:val="28"/>
+        </w:rPr>
+        <w:t>Цан Хай</w:t>
+      </w:r>
+      <w:r>
+        <w:rPr>
+          <w:rFonts w:ascii="Times New Roman" w:hAnsi="Times New Roman" w:cs="Times New Roman"/>
+          <w:sz w:val="28"/>
+          <w:szCs w:val="28"/>
+        </w:rPr>
+        <w:t xml:space="preserve"> – старший полный брат Тан Тай Цзиня</w:t>
+      </w:r>
+    </w:p>
+    <w:p>
+      <w:pPr>
+        <w:rPr>
+          <w:rFonts w:ascii="Times New Roman" w:hAnsi="Times New Roman" w:cs="Times New Roman"/>
+          <w:sz w:val="28"/>
+          <w:szCs w:val="28"/>
+        </w:rPr>
+      </w:pPr>
+      <w:r>
+        <w:rPr>
+          <w:rFonts w:ascii="Times New Roman" w:hAnsi="Times New Roman" w:cs="Times New Roman"/>
+          <w:b/>
+          <w:bCs/>
+          <w:sz w:val="28"/>
+          <w:szCs w:val="28"/>
+        </w:rPr>
+        <w:t>Чжао Ю</w:t>
+      </w:r>
+      <w:r>
+        <w:rPr>
+          <w:rFonts w:ascii="Times New Roman" w:hAnsi="Times New Roman" w:cs="Times New Roman"/>
+          <w:sz w:val="28"/>
+          <w:szCs w:val="28"/>
+        </w:rPr>
+        <w:t xml:space="preserve"> – владыка секты Сяояо</w:t>
+      </w:r>
+    </w:p>
+    <w:p>
+      <w:pPr>
+        <w:rPr>
+          <w:rFonts w:ascii="Times New Roman" w:hAnsi="Times New Roman" w:cs="Times New Roman"/>
+          <w:sz w:val="28"/>
+          <w:szCs w:val="28"/>
+        </w:rPr>
+      </w:pPr>
+      <w:r>
+        <w:rPr>
+          <w:rFonts w:ascii="Times New Roman" w:hAnsi="Times New Roman" w:cs="Times New Roman"/>
+          <w:b/>
+          <w:bCs/>
+          <w:sz w:val="28"/>
+          <w:szCs w:val="28"/>
+        </w:rPr>
+        <w:t>Цан Цзю Минь</w:t>
+      </w:r>
+      <w:r>
+        <w:rPr>
+          <w:rFonts w:ascii="Times New Roman" w:hAnsi="Times New Roman" w:cs="Times New Roman"/>
+          <w:sz w:val="28"/>
+          <w:szCs w:val="28"/>
+        </w:rPr>
+        <w:t xml:space="preserve"> – бессмертное воплощение </w:t>
+      </w:r>
+      <w:r>
+        <w:rPr>
+          <w:rFonts w:ascii="Times New Roman" w:hAnsi="Times New Roman" w:cs="Times New Roman"/>
+          <w:sz w:val="28"/>
+          <w:szCs w:val="28"/>
+        </w:rPr>
+        <w:t>Тан Тай Цзин</w:t>
+      </w:r>
+      <w:r>
+        <w:rPr>
+          <w:rFonts w:ascii="Times New Roman" w:hAnsi="Times New Roman" w:cs="Times New Roman"/>
+          <w:sz w:val="28"/>
+          <w:szCs w:val="28"/>
+        </w:rPr>
+        <w:t xml:space="preserve">я </w:t>
+      </w:r>
+    </w:p>
+    <w:p>
+      <w:pPr>
+        <w:rPr>
+          <w:rFonts w:ascii="Times New Roman" w:hAnsi="Times New Roman" w:cs="Times New Roman"/>
+          <w:sz w:val="28"/>
+          <w:szCs w:val="28"/>
+        </w:rPr>
+      </w:pPr>
+    </w:p>
+    <w:p>
+      <w:pPr>
+        <w:ind w:firstLine="709"/>
+        <w:rPr>
+          <w:rFonts w:ascii="Times New Roman" w:hAnsi="Times New Roman" w:cs="Times New Roman"/>
+          <w:sz w:val="28"/>
+          <w:szCs w:val="28"/>
+        </w:rPr>
+      </w:pPr>
+      <w:r>
+        <w:rPr>
+          <w:rFonts w:ascii="Times New Roman" w:hAnsi="Times New Roman" w:cs="Times New Roman"/>
+          <w:b/>
+          <w:bCs/>
+          <w:sz w:val="28"/>
+          <w:szCs w:val="28"/>
+        </w:rPr>
+        <w:t>Цяньло:</w:t>
+      </w:r>
+    </w:p>
+    <w:p>
+      <w:pPr>
+        <w:rPr>
+          <w:rFonts w:ascii="Times New Roman" w:hAnsi="Times New Roman" w:cs="Times New Roman"/>
+          <w:sz w:val="28"/>
+          <w:szCs w:val="28"/>
+        </w:rPr>
+      </w:pPr>
+      <w:r>
+        <w:rPr>
+          <w:rFonts w:ascii="Times New Roman" w:hAnsi="Times New Roman" w:cs="Times New Roman"/>
+          <w:b/>
+          <w:bCs/>
+          <w:sz w:val="28"/>
+          <w:szCs w:val="28"/>
+        </w:rPr>
+        <w:t>Лин Вэй Чен</w:t>
+      </w:r>
+      <w:r>
+        <w:rPr>
+          <w:rFonts w:ascii="Times New Roman" w:hAnsi="Times New Roman" w:cs="Times New Roman"/>
+          <w:sz w:val="28"/>
+          <w:szCs w:val="28"/>
+        </w:rPr>
+        <w:t xml:space="preserve"> – член одной секты, изменник, </w:t>
+      </w:r>
+      <w:r>
+        <w:rPr>
+          <w:rFonts w:ascii="Times New Roman" w:hAnsi="Times New Roman" w:cs="Times New Roman"/>
+          <w:sz w:val="28"/>
+          <w:szCs w:val="28"/>
+        </w:rPr>
+        <w:t>обладает двойной духовной природой – земли и древесины</w:t>
+      </w:r>
+      <w:r>
+        <w:rPr>
+          <w:rFonts w:ascii="Times New Roman" w:hAnsi="Times New Roman" w:cs="Times New Roman"/>
+          <w:sz w:val="28"/>
+          <w:szCs w:val="28"/>
+        </w:rPr>
+        <w:t>.</w:t>
+      </w:r>
+    </w:p>
+    <w:p>
+      <w:pPr>
+        <w:rPr>
+          <w:rFonts w:ascii="Times New Roman" w:hAnsi="Times New Roman" w:cs="Times New Roman"/>
+          <w:sz w:val="28"/>
+          <w:szCs w:val="28"/>
+        </w:rPr>
+      </w:pPr>
+      <w:r>
+        <w:rPr>
+          <w:rFonts w:ascii="Times New Roman" w:hAnsi="Times New Roman" w:cs="Times New Roman"/>
+          <w:b/>
+          <w:bCs/>
+          <w:sz w:val="28"/>
+          <w:szCs w:val="28"/>
+        </w:rPr>
+        <w:t>Ай Фэй Хэ</w:t>
+      </w:r>
+      <w:r>
+        <w:rPr>
+          <w:rFonts w:ascii="Times New Roman" w:hAnsi="Times New Roman" w:cs="Times New Roman"/>
+          <w:sz w:val="28"/>
+          <w:szCs w:val="28"/>
+        </w:rPr>
+        <w:t xml:space="preserve"> – возлюбленная Вэй Чена.</w:t>
+      </w:r>
+    </w:p>
+    <w:p>
+      <w:pPr>
+        <w:rPr>
+          <w:rFonts w:ascii="Times New Roman" w:hAnsi="Times New Roman" w:cs="Times New Roman"/>
+          <w:sz w:val="28"/>
+          <w:szCs w:val="28"/>
+        </w:rPr>
+      </w:pPr>
+      <w:r>
+        <w:rPr>
+          <w:rFonts w:ascii="Times New Roman" w:hAnsi="Times New Roman" w:cs="Times New Roman"/>
+          <w:b/>
+          <w:bCs/>
+          <w:sz w:val="28"/>
+          <w:szCs w:val="28"/>
+        </w:rPr>
+        <w:t>Дин Янь</w:t>
+      </w:r>
+      <w:r>
+        <w:rPr>
+          <w:rFonts w:ascii="Times New Roman" w:hAnsi="Times New Roman" w:cs="Times New Roman"/>
+          <w:sz w:val="28"/>
+          <w:szCs w:val="28"/>
+        </w:rPr>
+        <w:t xml:space="preserve"> – дочь главы неизвестного клана, обманутая Вэй Ченом.</w:t>
+      </w:r>
+    </w:p>
+    <w:p>
+      <w:pPr>
+        <w:rPr>
+          <w:rFonts w:ascii="Times New Roman" w:hAnsi="Times New Roman" w:cs="Times New Roman"/>
+          <w:sz w:val="28"/>
+          <w:szCs w:val="28"/>
+        </w:rPr>
+      </w:pPr>
+    </w:p>
+    <w:p>
+      <w:pPr>
+        <w:ind w:firstLine="708"/>
+        <w:rPr>
+          <w:rFonts w:ascii="Times New Roman" w:hAnsi="Times New Roman" w:cs="Times New Roman"/>
+          <w:b/>
+          <w:bCs/>
+          <w:sz w:val="28"/>
+          <w:szCs w:val="28"/>
+        </w:rPr>
+      </w:pPr>
       <w:r>
         <w:rPr>
           <w:rFonts w:ascii="Times New Roman" w:hAnsi="Times New Roman" w:cs="Times New Roman"/>
@@ -4439,7 +5399,6 @@
           <w:sz w:val="28"/>
           <w:szCs w:val="28"/>
         </w:rPr>
-        <w:lastRenderedPageBreak/>
         <w:t>Цзи Цзе</w:t>
       </w:r>
       <w:r>
@@ -4459,6 +5418,89 @@
           <w:szCs w:val="28"/>
         </w:rPr>
       </w:pPr>
+      <w:r>
+        <w:rPr>
+          <w:rFonts w:ascii="Times New Roman" w:hAnsi="Times New Roman" w:cs="Times New Roman"/>
+          <w:b/>
+          <w:bCs/>
+          <w:sz w:val="28"/>
+          <w:szCs w:val="28"/>
+        </w:rPr>
+        <w:t>Царь Цаньюань</w:t>
+      </w:r>
+      <w:r>
+        <w:rPr>
+          <w:rFonts w:ascii="Times New Roman" w:hAnsi="Times New Roman" w:cs="Times New Roman"/>
+          <w:b/>
+          <w:bCs/>
+          <w:sz w:val="28"/>
+          <w:szCs w:val="28"/>
+        </w:rPr>
+        <w:t xml:space="preserve"> </w:t>
+      </w:r>
+      <w:r>
+        <w:rPr>
+          <w:rFonts w:ascii="Times New Roman" w:hAnsi="Times New Roman" w:cs="Times New Roman"/>
+          <w:sz w:val="28"/>
+          <w:szCs w:val="28"/>
+        </w:rPr>
+        <w:t xml:space="preserve">– отец Ли Су </w:t>
+      </w:r>
+      <w:proofErr w:type="spellStart"/>
+      <w:r>
+        <w:rPr>
+          <w:rFonts w:ascii="Times New Roman" w:hAnsi="Times New Roman" w:cs="Times New Roman"/>
+          <w:sz w:val="28"/>
+          <w:szCs w:val="28"/>
+        </w:rPr>
+        <w:t>Су</w:t>
+      </w:r>
+      <w:proofErr w:type="spellEnd"/>
+      <w:r>
+        <w:rPr>
+          <w:rFonts w:ascii="Times New Roman" w:hAnsi="Times New Roman" w:cs="Times New Roman"/>
+          <w:sz w:val="28"/>
+          <w:szCs w:val="28"/>
+        </w:rPr>
+        <w:t>.</w:t>
+      </w:r>
+    </w:p>
+    <w:p>
+      <w:pPr>
+        <w:rPr>
+          <w:rFonts w:ascii="Times New Roman" w:hAnsi="Times New Roman" w:cs="Times New Roman"/>
+          <w:sz w:val="28"/>
+          <w:szCs w:val="28"/>
+        </w:rPr>
+      </w:pPr>
+      <w:r>
+        <w:rPr>
+          <w:rFonts w:ascii="Times New Roman" w:hAnsi="Times New Roman" w:cs="Times New Roman"/>
+          <w:b/>
+          <w:bCs/>
+          <w:sz w:val="28"/>
+          <w:szCs w:val="28"/>
+        </w:rPr>
+        <w:t>Чу Хуан</w:t>
+      </w:r>
+      <w:r>
+        <w:rPr>
+          <w:rFonts w:ascii="Times New Roman" w:hAnsi="Times New Roman" w:cs="Times New Roman"/>
+          <w:sz w:val="28"/>
+          <w:szCs w:val="28"/>
+        </w:rPr>
+        <w:t xml:space="preserve"> – мать Ли Су </w:t>
+      </w:r>
+      <w:proofErr w:type="spellStart"/>
+      <w:r>
+        <w:rPr>
+          <w:rFonts w:ascii="Times New Roman" w:hAnsi="Times New Roman" w:cs="Times New Roman"/>
+          <w:sz w:val="28"/>
+          <w:szCs w:val="28"/>
+        </w:rPr>
+        <w:t>Су</w:t>
+      </w:r>
+      <w:proofErr w:type="spellEnd"/>
     </w:p>
     <w:p>
       <w:pPr>
@@ -4916,6 +5958,7 @@
           <w:sz w:val="28"/>
           <w:szCs w:val="28"/>
         </w:rPr>
+        <w:lastRenderedPageBreak/>
         <w:t xml:space="preserve">Цзя Чунь </w:t>
       </w:r>
       <w:r>
@@ -5011,7 +6054,6 @@
           <w:sz w:val="28"/>
           <w:szCs w:val="28"/>
         </w:rPr>
-        <w:lastRenderedPageBreak/>
         <w:t>Мин Е</w:t>
       </w:r>
       <w:r>
@@ -5246,178 +6288,6 @@
           <w:szCs w:val="28"/>
         </w:rPr>
         <w:t xml:space="preserve"> – духовный зверь, демон-волк, которого спасла Сан Цзю и он стал её верным другом, чьё тело во сне дракона занял Сяо Линь</w:t>
-      </w:r>
-    </w:p>
-    <w:p>
-      <w:pPr>
-        <w:rPr>
-          <w:rFonts w:ascii="Times New Roman" w:hAnsi="Times New Roman" w:cs="Times New Roman"/>
-          <w:sz w:val="28"/>
-          <w:szCs w:val="28"/>
-        </w:rPr>
-      </w:pPr>
-      <w:r>
-        <w:rPr>
-          <w:rFonts w:ascii="Times New Roman" w:hAnsi="Times New Roman" w:cs="Times New Roman"/>
-          <w:noProof/>
-          <w:sz w:val="28"/>
-          <w:szCs w:val="28"/>
-        </w:rPr>
-        <w:drawing>
-          <wp:inline distT="0" distB="0" distL="0" distR="0">
-            <wp:extent cx="5940425" cy="3114040"/>
-            <wp:effectExtent l="0" t="0" r="3175" b="0"/>
-            <wp:docPr id="927462143" name="Рисунок 1"/>
-            <wp:cNvGraphicFramePr>
-              <a:graphicFrameLocks xmlns:a="http://schemas.openxmlformats.org/drawingml/2006/main" noChangeAspect="1"/>
-            </wp:cNvGraphicFramePr>
-            <a:graphic xmlns:a="http://schemas.openxmlformats.org/drawingml/2006/main">
-              <a:graphicData uri="http://schemas.openxmlformats.org/drawingml/2006/picture">
-                <pic:pic xmlns:pic="http://schemas.openxmlformats.org/drawingml/2006/picture">
-                  <pic:nvPicPr>
-                    <pic:cNvPr id="927462143" name="Рисунок 927462143"/>
-                    <pic:cNvPicPr/>
-                  </pic:nvPicPr>
-                  <pic:blipFill>
-                    <a:blip r:embed="rId4" cstate="print">
-                      <a:extLst>
-                        <a:ext uri="{28A0092B-C50C-407E-A947-70E740481C1C}">
-                          <a14:useLocalDpi xmlns:a14="http://schemas.microsoft.com/office/drawing/2010/main" val="0"/>
-                        </a:ext>
-                      </a:extLst>
-                    </a:blip>
-                    <a:stretch>
-                      <a:fillRect/>
-                    </a:stretch>
-                  </pic:blipFill>
-                  <pic:spPr>
-                    <a:xfrm>
-                      <a:off x="0" y="0"/>
-                      <a:ext cx="5940425" cy="3114040"/>
-                    </a:xfrm>
-                    <a:prstGeom prst="rect">
-                      <a:avLst/>
-                    </a:prstGeom>
-                  </pic:spPr>
-                </pic:pic>
-              </a:graphicData>
-            </a:graphic>
-          </wp:inline>
-        </w:drawing>
-      </w:r>
-    </w:p>
-    <w:p>
-      <w:pPr>
-        <w:rPr>
-          <w:rFonts w:ascii="Matura MT Script Capitals" w:eastAsia="Brush Script MT" w:hAnsi="Matura MT Script Capitals" w:cs="Brush Script MT"/>
-          <w:sz w:val="28"/>
-          <w:szCs w:val="28"/>
-        </w:rPr>
-      </w:pPr>
-      <w:r>
-        <w:rPr>
-          <w:rFonts w:ascii="Cambria" w:eastAsia="Brush Script MT" w:hAnsi="Cambria" w:cs="Cambria"/>
-          <w:sz w:val="28"/>
-          <w:szCs w:val="28"/>
-        </w:rPr>
-        <w:t>Мгновенное</w:t>
-      </w:r>
-      <w:r>
-        <w:rPr>
-          <w:rFonts w:ascii="Matura MT Script Capitals" w:eastAsia="Brush Script MT" w:hAnsi="Matura MT Script Capitals" w:cs="Brush Script MT"/>
-          <w:sz w:val="28"/>
-          <w:szCs w:val="28"/>
-        </w:rPr>
-        <w:t xml:space="preserve"> </w:t>
-      </w:r>
-      <w:r>
-        <w:rPr>
-          <w:rFonts w:ascii="Cambria" w:eastAsia="Brush Script MT" w:hAnsi="Cambria" w:cs="Cambria"/>
-          <w:sz w:val="28"/>
-          <w:szCs w:val="28"/>
-        </w:rPr>
-        <w:t>В</w:t>
-      </w:r>
-      <w:r>
-        <w:rPr>
-          <w:rFonts w:ascii="Cambria" w:eastAsia="Brush Script MT" w:hAnsi="Cambria" w:cs="Cambria"/>
-          <w:sz w:val="28"/>
-          <w:szCs w:val="28"/>
-        </w:rPr>
-        <w:t>ознесение</w:t>
-      </w:r>
-    </w:p>
-    <w:p>
-      <w:pPr>
-        <w:rPr>
-          <w:rFonts w:ascii="Matura MT Script Capitals" w:eastAsia="Brush Script MT" w:hAnsi="Matura MT Script Capitals" w:cs="Brush Script MT"/>
-          <w:sz w:val="28"/>
-          <w:szCs w:val="28"/>
-        </w:rPr>
-      </w:pPr>
-      <w:r>
-        <w:rPr>
-          <w:rFonts w:ascii="Matura MT Script Capitals" w:eastAsia="Brush Script MT" w:hAnsi="Matura MT Script Capitals" w:cs="Brush Script MT"/>
-          <w:sz w:val="28"/>
-          <w:szCs w:val="28"/>
-        </w:rPr>
-        <w:t xml:space="preserve">     </w:t>
-      </w:r>
-      <w:r>
-        <w:rPr>
-          <w:rFonts w:ascii="Matura MT Script Capitals" w:eastAsia="Brush Script MT" w:hAnsi="Matura MT Script Capitals" w:cs="Brush Script MT"/>
-          <w:sz w:val="28"/>
-          <w:szCs w:val="28"/>
-        </w:rPr>
-        <w:tab/>
-      </w:r>
-      <w:r>
-        <w:rPr>
-          <w:rFonts w:ascii="Matura MT Script Capitals" w:eastAsia="Brush Script MT" w:hAnsi="Matura MT Script Capitals" w:cs="Brush Script MT"/>
-          <w:sz w:val="28"/>
-          <w:szCs w:val="28"/>
-        </w:rPr>
-        <w:tab/>
-      </w:r>
-      <w:r>
-        <w:rPr>
-          <w:rFonts w:ascii="Cambria" w:eastAsia="Brush Script MT" w:hAnsi="Cambria" w:cs="Cambria"/>
-          <w:sz w:val="28"/>
-          <w:szCs w:val="28"/>
-        </w:rPr>
-        <w:t>В</w:t>
-      </w:r>
-      <w:r>
-        <w:rPr>
-          <w:rFonts w:ascii="Matura MT Script Capitals" w:eastAsia="Brush Script MT" w:hAnsi="Matura MT Script Capitals" w:cs="Brush Script MT"/>
-          <w:sz w:val="28"/>
-          <w:szCs w:val="28"/>
-        </w:rPr>
-        <w:t xml:space="preserve"> </w:t>
-      </w:r>
-      <w:r>
-        <w:rPr>
-          <w:rFonts w:ascii="Cambria" w:eastAsia="Brush Script MT" w:hAnsi="Cambria" w:cs="Cambria"/>
-          <w:sz w:val="28"/>
-          <w:szCs w:val="28"/>
-        </w:rPr>
-        <w:t>радиусе</w:t>
-      </w:r>
-      <w:r>
-        <w:rPr>
-          <w:rFonts w:ascii="Matura MT Script Capitals" w:eastAsia="Brush Script MT" w:hAnsi="Matura MT Script Capitals" w:cs="Brush Script MT"/>
-          <w:sz w:val="28"/>
-          <w:szCs w:val="28"/>
-        </w:rPr>
-        <w:t xml:space="preserve"> 10 </w:t>
-      </w:r>
-      <w:r>
-        <w:rPr>
-          <w:rFonts w:ascii="Cambria" w:eastAsia="Brush Script MT" w:hAnsi="Cambria" w:cs="Cambria"/>
-          <w:sz w:val="28"/>
-          <w:szCs w:val="28"/>
-        </w:rPr>
-        <w:t>метров</w:t>
       </w:r>
     </w:p>
     <w:sectPr>

</xml_diff>